<commit_message>
docs: fill synopsis fields, fix docx generator to include all prose
</commit_message>
<xml_diff>
--- a/docs/LegalSathi_AI_MCA_Project_Synopsis.docx
+++ b/docs/LegalSathi_AI_MCA_Project_Synopsis.docx
@@ -8,7 +8,6 @@
       </w:pPr>
       <w:r>
         <w:rPr>
-          <w:rFonts w:ascii="Calibri" w:hAnsi="Calibri"/>
           <w:b/>
           <w:color w:val="1F3A5F"/>
           <w:sz w:val="40"/>
@@ -23,6 +22,7 @@
       <w:r>
         <w:rPr>
           <w:i/>
+          <w:sz w:val="24"/>
         </w:rPr>
         <w:t>An AI-Powered, Multilingual Legal Information and Guidance Platform for Indian Citizens</w:t>
       </w:r>
@@ -34,8 +34,93 @@
       <w:r>
         <w:rPr>
           <w:i/>
+          <w:sz w:val="24"/>
         </w:rPr>
         <w:t>MCA Project Synopsis</w:t>
+      </w:r>
+    </w:p>
+    <w:p>
+      <w:pPr>
+        <w:jc w:val="center"/>
+      </w:pPr>
+      <w:r>
+        <w:t xml:space="preserve">Student Name: </w:t>
+      </w:r>
+      <w:r>
+        <w:rPr>
+          <w:b/>
+        </w:rPr>
+        <w:t>Dhiraj Nimje</w:t>
+      </w:r>
+    </w:p>
+    <w:p>
+      <w:pPr>
+        <w:jc w:val="center"/>
+      </w:pPr>
+      <w:r>
+        <w:t xml:space="preserve">Class: </w:t>
+      </w:r>
+      <w:r>
+        <w:rPr>
+          <w:b/>
+        </w:rPr>
+        <w:t>MCA</w:t>
+      </w:r>
+    </w:p>
+    <w:p>
+      <w:pPr>
+        <w:jc w:val="center"/>
+      </w:pPr>
+      <w:r>
+        <w:t xml:space="preserve">Enrollment Number: </w:t>
+      </w:r>
+      <w:r>
+        <w:rPr>
+          <w:b/>
+        </w:rPr>
+        <w:t>[To be provided]</w:t>
+      </w:r>
+    </w:p>
+    <w:p>
+      <w:pPr>
+        <w:jc w:val="center"/>
+      </w:pPr>
+      <w:r>
+        <w:t xml:space="preserve">Guide: </w:t>
+      </w:r>
+      <w:r>
+        <w:rPr>
+          <w:b/>
+        </w:rPr>
+        <w:t>[To be provided]</w:t>
+      </w:r>
+    </w:p>
+    <w:p>
+      <w:pPr>
+        <w:jc w:val="center"/>
+      </w:pPr>
+      <w:r>
+        <w:t xml:space="preserve">University / Institution: </w:t>
+      </w:r>
+      <w:r>
+        <w:rPr>
+          <w:b/>
+        </w:rPr>
+        <w:t>[To be provided]</w:t>
+      </w:r>
+    </w:p>
+    <w:p>
+      <w:pPr>
+        <w:jc w:val="center"/>
+      </w:pPr>
+      <w:r>
+        <w:t xml:space="preserve">Academic Year / Semester: </w:t>
+      </w:r>
+      <w:r>
+        <w:rPr>
+          <w:b/>
+        </w:rPr>
+        <w:t>2026–27 (Final Year)</w:t>
       </w:r>
     </w:p>
     <w:p>
@@ -45,7 +130,6 @@
       </w:pPr>
       <w:r>
         <w:rPr>
-          <w:rFonts w:ascii="Calibri" w:hAnsi="Calibri"/>
           <w:color w:val="1F3A5F"/>
         </w:rPr>
         <w:t>1. Title of the Project</w:t>
@@ -58,6 +142,7 @@
       <w:r>
         <w:rPr>
           <w:i/>
+          <w:sz w:val="24"/>
         </w:rPr>
         <w:t>**Legalsathi AI: An AI-Powered, Multilingual Legal Information and Guidance Platform for Indian Citizens**</w:t>
       </w:r>
@@ -69,10 +154,19 @@
       </w:pPr>
       <w:r>
         <w:rPr>
-          <w:rFonts w:ascii="Calibri" w:hAnsi="Calibri"/>
           <w:color w:val="1F3A5F"/>
         </w:rPr>
         <w:t>2. Introduction</w:t>
+      </w:r>
+    </w:p>
+    <w:p>
+      <w:r>
+        <w:t>Legal literacy in India is strikingly low, and professional legal advice is frequently unaffordable for large sections of the population. Every day, ordinary citizens encounter routine but stressful legal situations — unfair rent demands, wrongful termination, eve-teasing or harassment, domestic disputes, and increasingly common online financial frauds and OTP scams — where they do not know their rights, the relevant law, or the first step to take. Most available guidance is either expensive (lawyer consultations), inaccessible (dense, English-only legal texts), or unreliable (unverified online content).</w:t>
+      </w:r>
+    </w:p>
+    <w:p>
+      <w:r>
+        <w:t>Legalsathi AI addresses this gap by providing a free, web-based platform that offers conversational legal guidance grounded in actual Indian statutes, an evidence-led Case Navigator that helps a user organise their situation step by step, and automated generation of legal documents such as FIR narratives and legal notices. The system combines a large language model (Google Gemini) with a retrieval-augmented generation (RAG) pipeline over Indian legal corpora so that answers are traceable to source provisions, and it presents content in multiple languages, including Hindi and Marathi.</w:t>
       </w:r>
     </w:p>
     <w:p>
@@ -82,10 +176,19 @@
       </w:pPr>
       <w:r>
         <w:rPr>
-          <w:rFonts w:ascii="Calibri" w:hAnsi="Calibri"/>
           <w:color w:val="1F3A5F"/>
         </w:rPr>
         <w:t>3. Background / Context</w:t>
+      </w:r>
+    </w:p>
+    <w:p>
+      <w:r>
+        <w:t>The Indian legal system is governed by an extensive body of central and state legislation, along with a large volume of case law. For a non-lawyer, understanding which Act applies, which provision is relevant, and what procedure to follow is extremely difficult. Government legal aid (e.g., Lok Adalats, Legal Services Authorities) exists but is not uniformly accessible, especially through online channels.</w:t>
+      </w:r>
+    </w:p>
+    <w:p>
+      <w:r>
+        <w:t>Recent advances in generative AI and large language models have made it feasible to build systems that can read, summarise, and reason over legal text at scale. When combined with techniques such as RAG — where the model is made to answer only from retrieved, verifiable source documents rather than from memory alone — the risk of "hallucinated" legal advice is substantially reduced. This motivates a platform that couples an LLM with a curated, verifiable body of Indian legal knowledge.</w:t>
       </w:r>
     </w:p>
     <w:p>
@@ -95,10 +198,14 @@
       </w:pPr>
       <w:r>
         <w:rPr>
-          <w:rFonts w:ascii="Calibri" w:hAnsi="Calibri"/>
           <w:color w:val="1F3A5F"/>
         </w:rPr>
         <w:t>4. Problem Statement</w:t>
+      </w:r>
+    </w:p>
+    <w:p>
+      <w:r>
+        <w:t>The following problems were identified:</w:t>
       </w:r>
     </w:p>
     <w:p>
@@ -148,10 +255,14 @@
       </w:pPr>
       <w:r>
         <w:rPr>
-          <w:rFonts w:ascii="Calibri" w:hAnsi="Calibri"/>
           <w:color w:val="1F3A5F"/>
         </w:rPr>
         <w:t>5. Need for the Project</w:t>
+      </w:r>
+    </w:p>
+    <w:p>
+      <w:r>
+        <w:t>The need arises from three observable gaps: cost, language, and structure. Lawyers charge fees beyond the reach of many users; legal documents and statutes are written for professionals; and unstructured online queries rarely produce a complete, step-by-step outcome. A platform that offers grounded answers in the user's own language, walks them through their situation, and drafts preliminary legal documents at no cost directly addresses all three gaps. This makes the project socially relevant as well as technically challenging — an appropriate fit for an MCA major project.</w:t>
       </w:r>
     </w:p>
     <w:p>
@@ -161,10 +272,14 @@
       </w:pPr>
       <w:r>
         <w:rPr>
-          <w:rFonts w:ascii="Calibri" w:hAnsi="Calibri"/>
           <w:color w:val="1F3A5F"/>
         </w:rPr>
         <w:t>6. Aim</w:t>
+      </w:r>
+    </w:p>
+    <w:p>
+      <w:r>
+        <w:t>To design, build, and deploy a web-based, multilingual AI system that provides Indian citizens with free, source-backed legal information, step-by-step guidance for common legal situations, and automated drafting of legal documents, using a retrieval-augmented large language model.</w:t>
       </w:r>
     </w:p>
     <w:p>
@@ -174,7 +289,6 @@
       </w:pPr>
       <w:r>
         <w:rPr>
-          <w:rFonts w:ascii="Calibri" w:hAnsi="Calibri"/>
           <w:color w:val="1F3A5F"/>
         </w:rPr>
         <w:t>7. Objectives</w:t>
@@ -243,10 +357,38 @@
       </w:pPr>
       <w:r>
         <w:rPr>
-          <w:rFonts w:ascii="Calibri" w:hAnsi="Calibri"/>
           <w:color w:val="1F3A5F"/>
         </w:rPr>
         <w:t>8. Proposed System / Proposed Solution</w:t>
+      </w:r>
+    </w:p>
+    <w:p>
+      <w:r>
+        <w:t>The system is proposed as a full-stack, three-tier web application.</w:t>
+      </w:r>
+    </w:p>
+    <w:p>
+      <w:r>
+        <w:t>The frontend is a responsive single-page application built with Next.js and React that presents the interface for chat, case navigation, document generation, and the evidence vault. A thin proxy layer on the frontend forwards requests to the backend with enforced timeouts, insulating the user interface from backend failures with graceful 503 responses.</w:t>
+      </w:r>
+    </w:p>
+    <w:p>
+      <w:r>
+        <w:t>The backend is a REST API built with Python and FastAPI exposing modules for authentication, chat, navigation, document generation, evidence storage, announcements, and administration. It integrates Google Gemini for generation and extends it with a RAG retrieval layer over a curated corpus of Indian legal acts and summaries. Persistent user data is stored in SQLite through SQLAlchemy, with JWT-based authentication.</w:t>
+      </w:r>
+    </w:p>
+    <w:p>
+      <w:r>
+        <w:t xml:space="preserve">Currently </w:t>
+      </w:r>
+      <w:r>
+        <w:rPr>
+          <w:b/>
+        </w:rPr>
+        <w:t>fully implemented and live</w:t>
+      </w:r>
+      <w:r>
+        <w:t>: the AI chat, Case Navigator, document generator, evidence vault, admin dashboard, user registration/login, and multilingual responses form a working production platform accessible at a public URL. Proposed enhancements (persistent database, notification delivery, and expanded law coverage) are described in the Future Scope section.</w:t>
       </w:r>
     </w:p>
     <w:p>
@@ -256,10 +398,14 @@
       </w:pPr>
       <w:r>
         <w:rPr>
-          <w:rFonts w:ascii="Calibri" w:hAnsi="Calibri"/>
           <w:color w:val="1F3A5F"/>
         </w:rPr>
         <w:t>9. Methodology</w:t>
+      </w:r>
+    </w:p>
+    <w:p>
+      <w:r>
+        <w:t>The project follows an iterative software-development lifecycle:</w:t>
       </w:r>
     </w:p>
     <w:p>
@@ -361,16 +507,34 @@
       </w:r>
     </w:p>
     <w:p>
+      <w:r>
+        <w:t xml:space="preserve">For the AI/ML workflow, the project does not train a custom model; it uses a pre-trained commercial LLM through its API. The retrieval corpus acts as the "data layer": documents are cleaned, split into retrieval units, and indexed; the retrieved units are injected into the prompt; and outputs are evaluated qualitatively against source documents for correctness, citation fidelity, and language fluency. Future work may add offline embeddings and fine-tuning for Indian legal terminology. Datasets, preprocessing, and per-module corpus details are to be documented under </w:t>
+      </w:r>
+      <w:r>
+        <w:rPr>
+          <w:b/>
+        </w:rPr>
+        <w:t>[To be provided]</w:t>
+      </w:r>
+      <w:r>
+        <w:t xml:space="preserve"> if the guide requires an explicit dataset annexure.</w:t>
+      </w:r>
+    </w:p>
+    <w:p>
       <w:pPr>
         <w:pStyle w:val="Heading1"/>
         <w:spacing w:before="280"/>
       </w:pPr>
       <w:r>
         <w:rPr>
-          <w:rFonts w:ascii="Calibri" w:hAnsi="Calibri"/>
           <w:color w:val="1F3A5F"/>
         </w:rPr>
         <w:t>10. System Architecture / Workflow Description</w:t>
+      </w:r>
+    </w:p>
+    <w:p>
+      <w:r>
+        <w:t>The architecture is organised as a set of layers:</w:t>
       </w:r>
     </w:p>
     <w:p>
@@ -444,13 +608,17 @@
       </w:r>
     </w:p>
     <w:p>
+      <w:r>
+        <w:t>A typical workflow for a user is: register and log in, ask a legal question in the AI chat, receive an answer with citations, describe their situation in the Case Navigator, receive a structured analysis with urgency and domain, optionally generate a draft FIR or notice, and save it. Administrative users monitor usage through the dashboard and can suspend, activate, or remove users and review audit trails.</w:t>
+      </w:r>
+    </w:p>
+    <w:p>
       <w:pPr>
         <w:pStyle w:val="Heading1"/>
         <w:spacing w:before="280"/>
       </w:pPr>
       <w:r>
         <w:rPr>
-          <w:rFonts w:ascii="Calibri" w:hAnsi="Calibri"/>
           <w:color w:val="1F3A5F"/>
         </w:rPr>
         <w:t>11. Modules of the System</w:t>
@@ -575,7 +743,6 @@
       </w:pPr>
       <w:r>
         <w:rPr>
-          <w:rFonts w:ascii="Calibri" w:hAnsi="Calibri"/>
           <w:color w:val="1F3A5F"/>
         </w:rPr>
         <w:t>12. Technologies and Tools Used</w:t>
@@ -672,7 +839,6 @@
       </w:pPr>
       <w:r>
         <w:rPr>
-          <w:rFonts w:ascii="Calibri" w:hAnsi="Calibri"/>
           <w:color w:val="1F3A5F"/>
         </w:rPr>
         <w:t>13. Expected Results / Outcomes</w:t>
@@ -719,16 +885,8 @@
       </w:r>
     </w:p>
     <w:p>
-      <w:pPr>
-        <w:pStyle w:val="Heading1"/>
-        <w:spacing w:before="280"/>
-      </w:pPr>
       <w:r>
-        <w:rPr>
-          <w:rFonts w:ascii="Calibri" w:hAnsi="Calibri"/>
-          <w:color w:val="1F3A5F"/>
-        </w:rPr>
-        <w:t>14. Scope of the Project</w:t>
+        <w:t>The project does not make unsupported claims about prediction accuracy or court outcomes; success is measured by functional availability, correctness of citations against the corpus, and usability of the guided workflow.</w:t>
       </w:r>
     </w:p>
     <w:p>
@@ -738,7 +896,23 @@
       </w:pPr>
       <w:r>
         <w:rPr>
-          <w:rFonts w:ascii="Calibri" w:hAnsi="Calibri"/>
+          <w:color w:val="1F3A5F"/>
+        </w:rPr>
+        <w:t>14. Scope of the Project</w:t>
+      </w:r>
+    </w:p>
+    <w:p>
+      <w:r>
+        <w:t>The scope of the current implementation covers the most common everyday legal situations: rental and property disputes, workplace and employment issues, women's rights and harassment, and cyber/financial fraud including OTP and phishing scams. Content is provided in English, Hindi, and Marathi. The system produces information and draft documents and does not replace professional legal services. It is hosted as a public cloud deployment suitable for demonstration and academic evaluation.</w:t>
+      </w:r>
+    </w:p>
+    <w:p>
+      <w:pPr>
+        <w:pStyle w:val="Heading1"/>
+        <w:spacing w:before="280"/>
+      </w:pPr>
+      <w:r>
+        <w:rPr>
           <w:color w:val="1F3A5F"/>
         </w:rPr>
         <w:t>15. Limitations</w:t>
@@ -799,7 +973,6 @@
       </w:pPr>
       <w:r>
         <w:rPr>
-          <w:rFonts w:ascii="Calibri" w:hAnsi="Calibri"/>
           <w:color w:val="1F3A5F"/>
         </w:rPr>
         <w:t>16. Future Scope</w:t>
@@ -860,10 +1033,14 @@
       </w:pPr>
       <w:r>
         <w:rPr>
-          <w:rFonts w:ascii="Calibri" w:hAnsi="Calibri"/>
           <w:color w:val="1F3A5F"/>
         </w:rPr>
         <w:t>17. Conclusion</w:t>
+      </w:r>
+    </w:p>
+    <w:p>
+      <w:r>
+        <w:t>Legalsathi AI demonstrates how modern generative AI can be applied to a pressing social problem: making legal information free, understandable, and available in the user's own language. By grounding model answers in a verifiable corpus of Indian law, structuring the user's narrative through a Case Navigator, and automating the drafting of common legal documents, the project provides a practical, deployable tool for citizens. The implemented system is live, tested end to end, and provides a strong foundation for further enhancement in the areas of persistence, scale, and multilingual AI capability.</w:t>
       </w:r>
     </w:p>
     <w:p>
@@ -873,10 +1050,14 @@
       </w:pPr>
       <w:r>
         <w:rPr>
-          <w:rFonts w:ascii="Calibri" w:hAnsi="Calibri"/>
           <w:color w:val="1F3A5F"/>
         </w:rPr>
         <w:t>18. References</w:t>
+      </w:r>
+    </w:p>
+    <w:p>
+      <w:r>
+        <w:t>[To be provided — examples below, to be verified and reformatted per college style, e.g., APA/IEEE:]</w:t>
       </w:r>
     </w:p>
     <w:p>
@@ -942,7 +1123,6 @@
       </w:pPr>
       <w:r>
         <w:rPr>
-          <w:rFonts w:ascii="Calibri" w:hAnsi="Calibri"/>
           <w:color w:val="1F3A5F"/>
         </w:rPr>
         <w:t>Placeholders to Complete before Submission</w:t>
@@ -953,7 +1133,49 @@
         <w:pStyle w:val="ListBullet"/>
       </w:pPr>
       <w:r>
-        <w:t xml:space="preserve">Student name / enrollment number: </w:t>
+        <w:t xml:space="preserve">Student Name: </w:t>
+      </w:r>
+      <w:r>
+        <w:rPr>
+          <w:b/>
+        </w:rPr>
+        <w:t>Dhiraj Nimje</w:t>
+      </w:r>
+    </w:p>
+    <w:p>
+      <w:pPr>
+        <w:pStyle w:val="ListBullet"/>
+      </w:pPr>
+      <w:r>
+        <w:t xml:space="preserve">Project Type: </w:t>
+      </w:r>
+      <w:r>
+        <w:rPr>
+          <w:b/>
+        </w:rPr>
+        <w:t>Final Year Project (MCA)</w:t>
+      </w:r>
+    </w:p>
+    <w:p>
+      <w:pPr>
+        <w:pStyle w:val="ListBullet"/>
+      </w:pPr>
+      <w:r>
+        <w:t xml:space="preserve">Academic Year / Semester: </w:t>
+      </w:r>
+      <w:r>
+        <w:rPr>
+          <w:b/>
+        </w:rPr>
+        <w:t>2026–27</w:t>
+      </w:r>
+    </w:p>
+    <w:p>
+      <w:pPr>
+        <w:pStyle w:val="ListBullet"/>
+      </w:pPr>
+      <w:r>
+        <w:t xml:space="preserve">Enrollment Number: </w:t>
       </w:r>
       <w:r>
         <w:rPr>
@@ -982,34 +1204,6 @@
       </w:pPr>
       <w:r>
         <w:t xml:space="preserve">Project guide: </w:t>
-      </w:r>
-      <w:r>
-        <w:rPr>
-          <w:b/>
-        </w:rPr>
-        <w:t>[To be provided]</w:t>
-      </w:r>
-    </w:p>
-    <w:p>
-      <w:pPr>
-        <w:pStyle w:val="ListBullet"/>
-      </w:pPr>
-      <w:r>
-        <w:t xml:space="preserve">Academic year / semester: </w:t>
-      </w:r>
-      <w:r>
-        <w:rPr>
-          <w:b/>
-        </w:rPr>
-        <w:t>[To be provided]</w:t>
-      </w:r>
-    </w:p>
-    <w:p>
-      <w:pPr>
-        <w:pStyle w:val="ListBullet"/>
-      </w:pPr>
-      <w:r>
-        <w:t xml:space="preserve">Project type (Mini/Major/Final Year): </w:t>
       </w:r>
       <w:r>
         <w:rPr>

</xml_diff>